<commit_message>
updated with 3rd commit
</commit_message>
<xml_diff>
--- a/Git_Test.docx
+++ b/Git_Test.docx
@@ -199,6 +199,111 @@
           <w:lang w:val="en-US"/>
         </w:rPr>
       </w:pPr>
+      <w:r>
+        <w:rPr>
+          <w:rFonts w:ascii="Tahoma" w:hAnsi="Tahoma" w:cs="Tahoma"/>
+          <w:sz w:val="36"/>
+          <w:szCs w:val="36"/>
+          <w:lang w:val="en-US"/>
+        </w:rPr>
+        <w:t>2</w:t>
+      </w:r>
+      <w:r>
+        <w:rPr>
+          <w:rFonts w:ascii="Tahoma" w:hAnsi="Tahoma" w:cs="Tahoma"/>
+          <w:sz w:val="36"/>
+          <w:szCs w:val="36"/>
+          <w:vertAlign w:val="superscript"/>
+          <w:lang w:val="en-US"/>
+        </w:rPr>
+        <w:t>nd</w:t>
+      </w:r>
+      <w:r>
+        <w:rPr>
+          <w:rFonts w:ascii="Tahoma" w:hAnsi="Tahoma" w:cs="Tahoma"/>
+          <w:sz w:val="36"/>
+          <w:szCs w:val="36"/>
+          <w:lang w:val="en-US"/>
+        </w:rPr>
+        <w:t xml:space="preserve"> commit:</w:t>
+      </w:r>
+      <w:r>
+        <w:rPr>
+          <w:rFonts w:ascii="Tahoma" w:hAnsi="Tahoma" w:cs="Tahoma"/>
+          <w:sz w:val="36"/>
+          <w:szCs w:val="36"/>
+          <w:lang w:val="en-US"/>
+        </w:rPr>
+        <w:tab/>
+        <w:t>Let’s see how the second commit works.</w:t>
+      </w:r>
+    </w:p>
+    <w:p>
+      <w:pPr>
+        <w:rPr>
+          <w:rFonts w:ascii="Tahoma" w:hAnsi="Tahoma" w:cs="Tahoma"/>
+          <w:sz w:val="36"/>
+          <w:szCs w:val="36"/>
+          <w:lang w:val="en-US"/>
+        </w:rPr>
+      </w:pPr>
+      <w:r>
+        <w:rPr>
+          <w:rFonts w:ascii="Tahoma" w:hAnsi="Tahoma" w:cs="Tahoma"/>
+          <w:sz w:val="36"/>
+          <w:szCs w:val="36"/>
+          <w:lang w:val="en-US"/>
+        </w:rPr>
+        <w:t>3</w:t>
+      </w:r>
+      <w:r>
+        <w:rPr>
+          <w:rFonts w:ascii="Tahoma" w:hAnsi="Tahoma" w:cs="Tahoma"/>
+          <w:sz w:val="36"/>
+          <w:szCs w:val="36"/>
+          <w:vertAlign w:val="superscript"/>
+          <w:lang w:val="en-US"/>
+        </w:rPr>
+        <w:t>rd</w:t>
+      </w:r>
+      <w:r>
+        <w:rPr>
+          <w:rFonts w:ascii="Tahoma" w:hAnsi="Tahoma" w:cs="Tahoma"/>
+          <w:sz w:val="36"/>
+          <w:szCs w:val="36"/>
+          <w:lang w:val="en-US"/>
+        </w:rPr>
+        <w:t xml:space="preserve"> commit:</w:t>
+      </w:r>
+      <w:r>
+        <w:rPr>
+          <w:rFonts w:ascii="Tahoma" w:hAnsi="Tahoma" w:cs="Tahoma"/>
+          <w:sz w:val="36"/>
+          <w:szCs w:val="36"/>
+          <w:lang w:val="en-US"/>
+        </w:rPr>
+        <w:tab/>
+        <w:t>This is going to be the 3</w:t>
+      </w:r>
+      <w:r>
+        <w:rPr>
+          <w:rFonts w:ascii="Tahoma" w:hAnsi="Tahoma" w:cs="Tahoma"/>
+          <w:sz w:val="36"/>
+          <w:szCs w:val="36"/>
+          <w:vertAlign w:val="superscript"/>
+          <w:lang w:val="en-US"/>
+        </w:rPr>
+        <w:t>rd</w:t>
+      </w:r>
+      <w:r>
+        <w:rPr>
+          <w:rFonts w:ascii="Tahoma" w:hAnsi="Tahoma" w:cs="Tahoma"/>
+          <w:sz w:val="36"/>
+          <w:szCs w:val="36"/>
+          <w:lang w:val="en-US"/>
+        </w:rPr>
+        <w:t xml:space="preserve"> commit.</w:t>
+      </w:r>
       <w:bookmarkStart w:id="0" w:name="_GoBack"/>
       <w:bookmarkEnd w:id="0"/>
     </w:p>

</xml_diff>